<commit_message>
docs: record that storage is provisioned and its rules are live
storage.rules deployed to the-third-space-626e8. The bucket turned out to
already exist: an anonymous read of the-third-space-626e8.firebasestorage.app
answers 403, not 404, which is the deployed rules refusing a caller who is
not signed in. The appspot.com variant is 404, so the newer bucket naming
is the live one and matches EXPO_PUBLIC_FIREBASE_STORAGE_BUCKET.

The codemap's "someone must click Get started" blocker and the technical
document's matching row were therefore both stale. What replaces them is a
verification gap rather than a blocker: the five upload surfaces should now
work and none has been exercised on a device, and the client degrades
silently on failure, which is the shape of a problem that hides.

The degrade paths stay regardless — an upload can fail for a dozen reasons
that have nothing to do with whether a bucket exists.

Also corrects the app test count in the codemap to 564.
</commit_message>
<xml_diff>
--- a/docs/technical-document.docx
+++ b/docs/technical-document.docx
@@ -218,7 +218,7 @@
               <w:rPr>
                 <w:sz w:val="17"/>
               </w:rPr>
-              <w:t>312dfca — "feat: show the cloud prompts during the first session only"</w:t>
+              <w:t>104b7ad — "feat: settle the ambient field and put the event detail on glass"</w:t>
             </w:r>
           </w:p>
         </w:tc>
@@ -363,6 +363,42 @@
                 <w:sz w:val="17"/>
               </w:rPr>
               <w:t>tsc clean; 564/564 app tests; 52/52 rules tests; 23/23 functions tests</w:t>
+            </w:r>
+          </w:p>
+        </w:tc>
+      </w:tr>
+      <w:tr>
+        <w:tc>
+          <w:tcPr>
+            <w:tcW w:type="dxa" w:w="3024"/>
+          </w:tcPr>
+          <w:p>
+            <w:pPr>
+              <w:spacing w:after="40"/>
+            </w:pPr>
+            <w:r/>
+            <w:r>
+              <w:rPr>
+                <w:sz w:val="17"/>
+              </w:rPr>
+              <w:t>Live rules</w:t>
+            </w:r>
+          </w:p>
+        </w:tc>
+        <w:tc>
+          <w:tcPr>
+            <w:tcW w:type="dxa" w:w="6048"/>
+          </w:tcPr>
+          <w:p>
+            <w:pPr>
+              <w:spacing w:after="40"/>
+            </w:pPr>
+            <w:r/>
+            <w:r>
+              <w:rPr>
+                <w:sz w:val="17"/>
+              </w:rPr>
+              <w:t>firestore.rules (3 Sep 2026) and storage.rules (4 Sep 2026) both deployed</w:t>
             </w:r>
           </w:p>
         </w:tc>
@@ -9391,6 +9427,11 @@
       </w:r>
     </w:p>
     <w:p>
+      <w:r>
+        <w:t>Note the split of responsibility: the client only ever registers a token and reacts to a tap. If push appears broken, the question is which half — a missing token document under users/{uid} is a client problem, and a token that exists while nothing arrives is a functions problem.</w:t>
+      </w:r>
+    </w:p>
+    <w:p>
       <w:pPr>
         <w:pStyle w:val="Heading2"/>
       </w:pPr>
@@ -12185,7 +12226,7 @@
         <w:spacing w:after="0" w:before="0"/>
       </w:pPr>
       <w:r>
-        <w:t>npx firebase-tools deploy --only firestore:rules            # what is live today</w:t>
+        <w:t>npx firebase-tools deploy --only firestore:rules,storage    # both are live as of 4 Sep 2026</w:t>
       </w:r>
     </w:p>
     <w:p>
@@ -12194,7 +12235,16 @@
         <w:spacing w:after="0" w:before="0"/>
       </w:pPr>
       <w:r>
-        <w:t>npx firebase-tools deploy --only firestore:rules,storage    # once a bucket exists</w:t>
+        <w:t>npx firebase-tools deploy --only firestore:rules             # Firestore only</w:t>
+      </w:r>
+    </w:p>
+    <w:p>
+      <w:pPr>
+        <w:pStyle w:val="CodeBlock"/>
+        <w:spacing w:after="0" w:before="0"/>
+      </w:pPr>
+      <w:r>
+        <w:t>npx firebase-tools deploy --only storage                     # Storage only</w:t>
       </w:r>
     </w:p>
     <w:p>
@@ -12280,7 +12330,7 @@
           <w:i/>
           <w:color w:val="584C3C"/>
         </w:rPr>
-        <w:t>v2 Cloud Functions require the Blaze (pay-as-you-go) plan, because they build through Cloud Build and are stored in Artifact Registry. On the Spark plan this deploy cannot succeed, which is why none of the five functions is live. See section 16.1.</w:t>
+        <w:t>v2 Cloud Functions require the Blaze (pay-as-you-go) plan, because they build through Cloud Build and are stored in Artifact Registry. The plan appears to be in place — the Storage bucket exists, which Blaze also gates — so this deploy is most likely unblocked, but none of the five functions has actually been deployed yet. It is the one outstanding release blocker; see section 16.1.</w:t>
       </w:r>
     </w:p>
     <w:p>
@@ -12364,7 +12414,7 @@
         <w:spacing w:after="60"/>
       </w:pPr>
       <w:r>
-        <w:t>Provision Cloud Storage in the Firebase console (Build -&gt; Storage -&gt; Get started). Until this exists, every upload fails and degrades, and storage.rules cannot be deployed.</w:t>
+        <w:t>Exercise media uploads on a real device — avatar, a vibe slot, an event cover, a venue photo and a chat attachment. The bucket and its rules went live on 4 September 2026 and nothing has been uploaded through them yet, so this path is unproven rather than known good.</w:t>
       </w:r>
     </w:p>
     <w:p>
@@ -12373,7 +12423,7 @@
         <w:spacing w:after="60"/>
       </w:pPr>
       <w:r>
-        <w:t>Upgrade the project to Blaze, then deploy functions. Without this, email sign-up and phone sign-in are broken and no push is ever delivered.</w:t>
+        <w:t>Deploy the Cloud Functions. Until they exist, email sign-up and phone sign-in are broken and no push is ever delivered (section 16.1).</w:t>
       </w:r>
     </w:p>
     <w:p>
@@ -12382,7 +12432,7 @@
         <w:spacing w:after="60"/>
       </w:pPr>
       <w:r>
-        <w:t>Deploy rules: `npx firebase-tools deploy --only firestore:rules,storage`.</w:t>
+        <w:t>Confirm rules are current: both rulesets are live, so redeploy only if firestore.rules or storage.rules changed since 4 September 2026.</w:t>
       </w:r>
     </w:p>
     <w:p>
@@ -12585,7 +12635,7 @@
               <w:rPr>
                 <w:sz w:val="17"/>
               </w:rPr>
-              <w:t>Cloud Storage not provisioned</w:t>
+              <w:t>Media uploads never exercised against the real bucket</w:t>
             </w:r>
           </w:p>
         </w:tc>
@@ -12602,7 +12652,7 @@
               <w:rPr>
                 <w:sz w:val="17"/>
               </w:rPr>
-              <w:t>Every upload fails and degrades by design: utils/avatar.ts renders coloured initials, TicketCard draws its "No photo yet" band, and the vibe / venue / cover slots stay empty.</w:t>
+              <w:t>Not a blocker so much as an unproven path. Storage was provisioned and storage.rules deployed on 4 September 2026, so the five upload surfaces should work for the first time — but nothing has been through them yet, and the client degrades silently on failure, which is exactly the shape of a problem that hides.</w:t>
             </w:r>
           </w:p>
         </w:tc>
@@ -12619,60 +12669,7 @@
               <w:rPr>
                 <w:sz w:val="17"/>
               </w:rPr>
-              <w:t>Firebase console -&gt; Build -&gt; Storage -&gt; Get started (Blaze).</w:t>
-            </w:r>
-          </w:p>
-        </w:tc>
-      </w:tr>
-      <w:tr>
-        <w:tc>
-          <w:tcPr>
-            <w:tcW w:type="dxa" w:w="2448"/>
-          </w:tcPr>
-          <w:p>
-            <w:pPr>
-              <w:spacing w:after="40"/>
-            </w:pPr>
-            <w:r/>
-            <w:r>
-              <w:rPr>
-                <w:sz w:val="17"/>
-              </w:rPr>
-              <w:t>`storage.rules` written and emulator-tested but not deployed</w:t>
-            </w:r>
-          </w:p>
-        </w:tc>
-        <w:tc>
-          <w:tcPr>
-            <w:tcW w:type="dxa" w:w="4320"/>
-          </w:tcPr>
-          <w:p>
-            <w:pPr>
-              <w:spacing w:after="40"/>
-            </w:pPr>
-            <w:r/>
-            <w:r>
-              <w:rPr>
-                <w:sz w:val="17"/>
-              </w:rPr>
-              <w:t>Nothing today, since there is no bucket to protect. It must ship in the same change as the bucket, or media paths would be unprotected the moment one exists.</w:t>
-            </w:r>
-          </w:p>
-        </w:tc>
-        <w:tc>
-          <w:tcPr>
-            <w:tcW w:type="dxa" w:w="2304"/>
-          </w:tcPr>
-          <w:p>
-            <w:pPr>
-              <w:spacing w:after="40"/>
-            </w:pPr>
-            <w:r/>
-            <w:r>
-              <w:rPr>
-                <w:sz w:val="17"/>
-              </w:rPr>
-              <w:t>`npx firebase-tools deploy --only storage` once the bucket exists.</w:t>
+              <w:t>One pass on a device: avatar, vibe slot, event cover, venue photo, chat attachment.</w:t>
             </w:r>
           </w:p>
         </w:tc>
@@ -12715,10 +12712,10 @@
         <w:rPr>
           <w:b/>
         </w:rPr>
-        <w:t xml:space="preserve">Firestore rules ARE live — </w:t>
-      </w:r>
-      <w:r>
-        <w:t>deployed 2026-09-03, including the write-once role split, the conversations null guard and the socials mutual-follow gate.</w:t>
+        <w:t xml:space="preserve">Both rulesets ARE live — </w:t>
+      </w:r>
+      <w:r>
+        <w:t>firestore.rules deployed 2026-09-03 (the write-once role split, the conversations null guard and the socials mutual-follow gate) and storage.rules deployed 2026-09-04. An anonymous read of the bucket answers 403 rather than 404, which is the deployed rules refusing a caller who is not signed in — the bucket exists and it is protected.</w:t>
       </w:r>
     </w:p>
     <w:p>

</xml_diff>